<commit_message>
feat(lab03): update to variant 38 Lanchester models (X=882k, Y=747k)
</commit_message>
<xml_diff>
--- a/labs/lab03/report/mathmod-lab03-report.docx
+++ b/labs/lab03/report/mathmod-lab03-report.docx
@@ -15,7 +15,7 @@
         <w:pStyle w:val="Subtitle"/>
       </w:pPr>
       <w:r>
-        <w:t xml:space="preserve">Моделирование боевых действий</w:t>
+        <w:t xml:space="preserve">Вариант 38</w:t>
       </w:r>
     </w:p>
     <w:p>
@@ -39,31 +39,25 @@
         <w:pStyle w:val="Abstract"/>
       </w:pPr>
       <w:r>
-        <w:t xml:space="preserve">Рассматриваются три модели боевых действий (модели Ланчестера):</w:t>
+        <w:t xml:space="preserve">Рассматриваются модели боевых действий (Ланчестера) для варианта 38:</w:t>
       </w:r>
       <w:r>
         <w:t xml:space="preserve"> </w:t>
       </w:r>
       <w:r>
-        <w:t xml:space="preserve">между регулярными войсками, между регулярными войсками и партизанами,</w:t>
+        <w:t xml:space="preserve">страна X имеет армию 882 000 человек, страна Y — 747 000 человек.</w:t>
       </w:r>
       <w:r>
         <w:t xml:space="preserve"> </w:t>
       </w:r>
       <w:r>
-        <w:t xml:space="preserve">между партизанскими отрядами. Проводится численное решение систем</w:t>
+        <w:t xml:space="preserve">Решаются две модели: между регулярными войсками и между регулярными</w:t>
       </w:r>
       <w:r>
         <w:t xml:space="preserve"> </w:t>
       </w:r>
       <w:r>
-        <w:t xml:space="preserve">дифференциальных уравнений в Julia, строятся графики динамики</w:t>
-      </w:r>
-      <w:r>
-        <w:t xml:space="preserve"> </w:t>
-      </w:r>
-      <w:r>
-        <w:t xml:space="preserve">численностей сторон, определяется победитель в каждом случае.</w:t>
+        <w:t xml:space="preserve">войсками и партизанами.</w:t>
       </w:r>
     </w:p>
     <w:sdt>
@@ -92,7 +86,7 @@
         </w:p>
       </w:sdtContent>
     </w:sdt>
-    <w:bookmarkStart w:id="25" w:name="введение"/>
+    <w:bookmarkStart w:id="24" w:name="введение"/>
     <w:p>
       <w:pPr>
         <w:pStyle w:val="Heading1"/>
@@ -121,13 +115,7 @@
         <w:t xml:space="preserve"> </w:t>
       </w:r>
       <w:r>
-        <w:t xml:space="preserve">применяемый в теории игр, военном деле, экономике (конкуренция фирм),</w:t>
-      </w:r>
-      <w:r>
-        <w:t xml:space="preserve"> </w:t>
-      </w:r>
-      <w:r>
-        <w:t xml:space="preserve">эпидемиологии (борьба с инфекциями).</w:t>
+        <w:t xml:space="preserve">применяемый в теории игр, военном деле, экономике.</w:t>
       </w:r>
     </w:p>
     <w:bookmarkEnd w:id="20"/>
@@ -145,13 +133,13 @@
         <w:pStyle w:val="FirstParagraph"/>
       </w:pPr>
       <w:r>
-        <w:t xml:space="preserve">Исследовать три модели боевых действий (Ланчестера) численно и определить</w:t>
+        <w:t xml:space="preserve">Исследовать численно модели боевых действий для заданных начальных</w:t>
       </w:r>
       <w:r>
         <w:t xml:space="preserve"> </w:t>
       </w:r>
       <w:r>
-        <w:t xml:space="preserve">условия победы каждой стороны.</w:t>
+        <w:t xml:space="preserve">численностей сторон и параметров (вариант 38).</w:t>
       </w:r>
     </w:p>
     <w:bookmarkEnd w:id="21"/>
@@ -173,7 +161,7 @@
         </w:numPr>
       </w:pPr>
       <w:r>
-        <w:t xml:space="preserve">Вывести системы дифференциальных уравнений для трёх моделей.</w:t>
+        <w:t xml:space="preserve">Решить модель боя между регулярными войсками.</w:t>
       </w:r>
     </w:p>
     <w:p>
@@ -185,7 +173,7 @@
         </w:numPr>
       </w:pPr>
       <w:r>
-        <w:t xml:space="preserve">Численно решить их в Julia для заданных начальных условий.</w:t>
+        <w:t xml:space="preserve">Решить модель боя между регулярными войсками и партизанами.</w:t>
       </w:r>
     </w:p>
     <w:p>
@@ -209,73 +197,17 @@
         </w:numPr>
       </w:pPr>
       <w:r>
-        <w:t xml:space="preserve">Определить победителя в каждом случае.</w:t>
-      </w:r>
-    </w:p>
-    <w:p>
-      <w:pPr>
-        <w:pStyle w:val="Compact"/>
-        <w:numPr>
-          <w:ilvl w:val="0"/>
-          <w:numId w:val="1001"/>
-        </w:numPr>
-      </w:pPr>
-      <w:r>
-        <w:t xml:space="preserve">Проанализировать условия победы.</w:t>
+        <w:t xml:space="preserve">Определить победителя в каждой модели.</w:t>
       </w:r>
     </w:p>
     <w:bookmarkEnd w:id="22"/>
-    <w:bookmarkStart w:id="23" w:name="объект-и-предмет-исследования"/>
+    <w:bookmarkStart w:id="23" w:name="методы-исследования"/>
     <w:p>
       <w:pPr>
         <w:pStyle w:val="Heading2"/>
       </w:pPr>
       <w:r>
-        <w:t xml:space="preserve">1.4 Объект и предмет исследования</w:t>
-      </w:r>
-    </w:p>
-    <w:p>
-      <w:pPr>
-        <w:pStyle w:val="FirstParagraph"/>
-      </w:pPr>
-      <w:r>
-        <w:rPr>
-          <w:b/>
-          <w:bCs/>
-        </w:rPr>
-        <w:t xml:space="preserve">Объект:</w:t>
-      </w:r>
-      <w:r>
-        <w:t xml:space="preserve"> </w:t>
-      </w:r>
-      <w:r>
-        <w:t xml:space="preserve">конфликт двух сторон X и Y.</w:t>
-      </w:r>
-      <w:r>
-        <w:t xml:space="preserve"> </w:t>
-      </w:r>
-      <w:r>
-        <w:rPr>
-          <w:b/>
-          <w:bCs/>
-        </w:rPr>
-        <w:t xml:space="preserve">Предмет:</w:t>
-      </w:r>
-      <w:r>
-        <w:t xml:space="preserve"> </w:t>
-      </w:r>
-      <w:r>
-        <w:t xml:space="preserve">динамика численностей сторон во времени.</w:t>
-      </w:r>
-    </w:p>
-    <w:bookmarkEnd w:id="23"/>
-    <w:bookmarkStart w:id="24" w:name="методы-исследования"/>
-    <w:p>
-      <w:pPr>
-        <w:pStyle w:val="Heading2"/>
-      </w:pPr>
-      <w:r>
-        <w:t xml:space="preserve">1.5 Методы исследования</w:t>
+        <w:t xml:space="preserve">1.4 Методы исследования</w:t>
       </w:r>
     </w:p>
     <w:p>
@@ -316,9 +248,9 @@
         <w:t xml:space="preserve">.</w:t>
       </w:r>
     </w:p>
+    <w:bookmarkEnd w:id="23"/>
     <w:bookmarkEnd w:id="24"/>
-    <w:bookmarkEnd w:id="25"/>
-    <w:bookmarkStart w:id="28" w:name="теоретическая-часть"/>
+    <w:bookmarkStart w:id="27" w:name="теоретическая-часть"/>
     <w:p>
       <w:pPr>
         <w:pStyle w:val="Heading1"/>
@@ -327,33 +259,18 @@
         <w:t xml:space="preserve">2. Теоретическая часть</w:t>
       </w:r>
     </w:p>
-    <w:bookmarkStart w:id="26" w:name="модели-ланчестера"/>
+    <w:bookmarkStart w:id="25" w:name="модель-1-регулярные-vs-регулярные"/>
     <w:p>
       <w:pPr>
         <w:pStyle w:val="Heading2"/>
       </w:pPr>
       <w:r>
-        <w:t xml:space="preserve">2.1 Модели Ланчестера</w:t>
-      </w:r>
-    </w:p>
-    <w:p>
-      <w:pPr>
-        <w:numPr>
-          <w:ilvl w:val="0"/>
-          <w:numId w:val="1002"/>
-        </w:numPr>
-      </w:pPr>
-      <w:r>
-        <w:rPr>
-          <w:b/>
-          <w:bCs/>
-        </w:rPr>
-        <w:t xml:space="preserve">Регулярные войска против регулярных войск:</w:t>
-      </w:r>
-    </w:p>
-    <w:p>
-      <w:pPr>
-        <w:pStyle w:val="BodyText"/>
+        <w:t xml:space="preserve">2.1 Модель 1: регулярные vs регулярные</w:t>
+      </w:r>
+    </w:p>
+    <w:p>
+      <w:pPr>
+        <w:pStyle w:val="FirstParagraph"/>
       </w:pPr>
       <m:oMathPara>
         <m:oMathParaPr>
@@ -394,7 +311,7 @@
             <m:t>−</m:t>
           </m:r>
           <m:r>
-            <m:t>a</m:t>
+            <m:t>0.4</m:t>
           </m:r>
           <m:r>
             <m:t>x</m:t>
@@ -406,7 +323,7 @@
             <m:t>−</m:t>
           </m:r>
           <m:r>
-            <m:t>b</m:t>
+            <m:t>0.67</m:t>
           </m:r>
           <m:r>
             <m:t>y</m:t>
@@ -418,7 +335,10 @@
             <m:t>+</m:t>
           </m:r>
           <m:r>
-            <m:t>P</m:t>
+            <m:rPr>
+              <m:sty m:val="p"/>
+            </m:rPr>
+            <m:t>sin</m:t>
           </m:r>
           <m:d>
             <m:dPr>
@@ -429,6 +349,9 @@
             </m:dPr>
             <m:e>
               <m:r>
+                <m:t>3</m:t>
+              </m:r>
+              <m:r>
                 <m:t>t</m:t>
               </m:r>
             </m:e>
@@ -437,11 +360,23 @@
             <m:rPr>
               <m:sty m:val="p"/>
             </m:rPr>
-            <m:t>,</m:t>
-          </m:r>
-          <m:r>
-            <m:t> </m:t>
-          </m:r>
+            <m:t>+</m:t>
+          </m:r>
+          <m:r>
+            <m:t>1</m:t>
+          </m:r>
+        </m:oMath>
+      </m:oMathPara>
+    </w:p>
+    <w:p>
+      <w:pPr>
+        <w:pStyle w:val="FirstParagraph"/>
+      </w:pPr>
+      <m:oMathPara>
+        <m:oMathParaPr>
+          <m:jc m:val="center"/>
+        </m:oMathParaPr>
+        <m:oMath>
           <m:f>
             <m:fPr>
               <m:type m:val="bar"/>
@@ -476,7 +411,7 @@
             <m:t>−</m:t>
           </m:r>
           <m:r>
-            <m:t>c</m:t>
+            <m:t>0.77</m:t>
           </m:r>
           <m:r>
             <m:t>x</m:t>
@@ -488,7 +423,7 @@
             <m:t>−</m:t>
           </m:r>
           <m:r>
-            <m:t>h</m:t>
+            <m:t>0.14</m:t>
           </m:r>
           <m:r>
             <m:t>y</m:t>
@@ -500,7 +435,10 @@
             <m:t>+</m:t>
           </m:r>
           <m:r>
-            <m:t>Q</m:t>
+            <m:rPr>
+              <m:sty m:val="p"/>
+            </m:rPr>
+            <m:t>cos</m:t>
           </m:r>
           <m:d>
             <m:dPr>
@@ -511,31 +449,38 @@
             </m:dPr>
             <m:e>
               <m:r>
+                <m:t>2</m:t>
+              </m:r>
+              <m:r>
                 <m:t>t</m:t>
               </m:r>
             </m:e>
           </m:d>
+          <m:r>
+            <m:rPr>
+              <m:sty m:val="p"/>
+            </m:rPr>
+            <m:t>+</m:t>
+          </m:r>
+          <m:r>
+            <m:t>2</m:t>
+          </m:r>
         </m:oMath>
       </m:oMathPara>
     </w:p>
-    <w:p>
-      <w:pPr>
-        <w:numPr>
-          <w:ilvl w:val="0"/>
-          <w:numId w:val="1002"/>
-        </w:numPr>
-      </w:pPr>
-      <w:r>
-        <w:rPr>
-          <w:b/>
-          <w:bCs/>
-        </w:rPr>
-        <w:t xml:space="preserve">Регулярные войска против партизан:</w:t>
-      </w:r>
-    </w:p>
-    <w:p>
-      <w:pPr>
-        <w:pStyle w:val="BodyText"/>
+    <w:bookmarkEnd w:id="25"/>
+    <w:bookmarkStart w:id="26" w:name="модель-2-регулярные-vs-партизаны"/>
+    <w:p>
+      <w:pPr>
+        <w:pStyle w:val="Heading2"/>
+      </w:pPr>
+      <w:r>
+        <w:t xml:space="preserve">2.2 Модель 2: регулярные vs партизаны</w:t>
+      </w:r>
+    </w:p>
+    <w:p>
+      <w:pPr>
+        <w:pStyle w:val="FirstParagraph"/>
       </w:pPr>
       <m:oMathPara>
         <m:oMathParaPr>
@@ -576,7 +521,7 @@
             <m:t>−</m:t>
           </m:r>
           <m:r>
-            <m:t>a</m:t>
+            <m:t>0.24</m:t>
           </m:r>
           <m:r>
             <m:t>x</m:t>
@@ -588,7 +533,7 @@
             <m:t>−</m:t>
           </m:r>
           <m:r>
-            <m:t>b</m:t>
+            <m:t>0.67</m:t>
           </m:r>
           <m:r>
             <m:t>y</m:t>
@@ -599,31 +544,50 @@
             </m:rPr>
             <m:t>+</m:t>
           </m:r>
-          <m:r>
-            <m:t>P</m:t>
-          </m:r>
           <m:d>
             <m:dPr>
-              <m:begChr m:val="("/>
+              <m:begChr m:val="|"/>
               <m:sepChr m:val=""/>
-              <m:endChr m:val=")"/>
+              <m:endChr m:val="|"/>
               <m:grow/>
             </m:dPr>
             <m:e>
               <m:r>
-                <m:t>t</m:t>
+                <m:rPr>
+                  <m:sty m:val="p"/>
+                </m:rPr>
+                <m:t>sin</m:t>
               </m:r>
+              <m:d>
+                <m:dPr>
+                  <m:begChr m:val="("/>
+                  <m:sepChr m:val=""/>
+                  <m:endChr m:val=")"/>
+                  <m:grow/>
+                </m:dPr>
+                <m:e>
+                  <m:r>
+                    <m:t>2</m:t>
+                  </m:r>
+                  <m:r>
+                    <m:t>t</m:t>
+                  </m:r>
+                </m:e>
+              </m:d>
             </m:e>
           </m:d>
-          <m:r>
-            <m:rPr>
-              <m:sty m:val="p"/>
-            </m:rPr>
-            <m:t>,</m:t>
-          </m:r>
-          <m:r>
-            <m:t> </m:t>
-          </m:r>
+        </m:oMath>
+      </m:oMathPara>
+    </w:p>
+    <w:p>
+      <w:pPr>
+        <w:pStyle w:val="FirstParagraph"/>
+      </w:pPr>
+      <m:oMathPara>
+        <m:oMathParaPr>
+          <m:jc m:val="center"/>
+        </m:oMathParaPr>
+        <m:oMath>
           <m:f>
             <m:fPr>
               <m:type m:val="bar"/>
@@ -658,7 +622,7 @@
             <m:t>−</m:t>
           </m:r>
           <m:r>
-            <m:t>c</m:t>
+            <m:t>0.47</m:t>
           </m:r>
           <m:r>
             <m:t>x</m:t>
@@ -673,7 +637,7 @@
             <m:t>−</m:t>
           </m:r>
           <m:r>
-            <m:t>h</m:t>
+            <m:t>0.14</m:t>
           </m:r>
           <m:r>
             <m:t>y</m:t>
@@ -684,27 +648,63 @@
             </m:rPr>
             <m:t>+</m:t>
           </m:r>
-          <m:r>
-            <m:t>Q</m:t>
-          </m:r>
           <m:d>
             <m:dPr>
-              <m:begChr m:val="("/>
+              <m:begChr m:val="|"/>
               <m:sepChr m:val=""/>
-              <m:endChr m:val=")"/>
+              <m:endChr m:val="|"/>
               <m:grow/>
             </m:dPr>
             <m:e>
               <m:r>
-                <m:t>t</m:t>
+                <m:rPr>
+                  <m:sty m:val="p"/>
+                </m:rPr>
+                <m:t>cos</m:t>
               </m:r>
+              <m:d>
+                <m:dPr>
+                  <m:begChr m:val="("/>
+                  <m:sepChr m:val=""/>
+                  <m:endChr m:val=")"/>
+                  <m:grow/>
+                </m:dPr>
+                <m:e>
+                  <m:r>
+                    <m:t>2</m:t>
+                  </m:r>
+                  <m:r>
+                    <m:t>t</m:t>
+                  </m:r>
+                </m:e>
+              </m:d>
             </m:e>
           </m:d>
         </m:oMath>
       </m:oMathPara>
     </w:p>
-    <w:p>
-      <w:pPr>
+    <w:bookmarkEnd w:id="26"/>
+    <w:bookmarkEnd w:id="27"/>
+    <w:bookmarkStart w:id="29" w:name="материалы-и-методы"/>
+    <w:p>
+      <w:pPr>
+        <w:pStyle w:val="Heading1"/>
+      </w:pPr>
+      <w:r>
+        <w:t xml:space="preserve">3. Материалы и методы</w:t>
+      </w:r>
+    </w:p>
+    <w:p>
+      <w:pPr>
+        <w:pStyle w:val="FirstParagraph"/>
+      </w:pPr>
+      <w:r>
+        <w:t xml:space="preserve">Работа выполнена на языке Julia 1.13 с пакетами:</w:t>
+      </w:r>
+    </w:p>
+    <w:p>
+      <w:pPr>
+        <w:pStyle w:val="Compact"/>
         <w:numPr>
           <w:ilvl w:val="0"/>
           <w:numId w:val="1002"/>
@@ -712,532 +712,87 @@
       </w:pPr>
       <w:r>
         <w:rPr>
-          <w:b/>
-          <w:bCs/>
+          <w:rStyle w:val="VerbatimChar"/>
         </w:rPr>
-        <w:t xml:space="preserve">Партизаны против партизан:</w:t>
-      </w:r>
-    </w:p>
-    <w:p>
-      <w:pPr>
-        <w:pStyle w:val="BodyText"/>
-      </w:pPr>
-      <m:oMathPara>
-        <m:oMathParaPr>
-          <m:jc m:val="center"/>
-        </m:oMathParaPr>
-        <m:oMath>
-          <m:f>
-            <m:fPr>
-              <m:type m:val="bar"/>
-            </m:fPr>
-            <m:num>
-              <m:r>
-                <m:t>d</m:t>
-              </m:r>
-              <m:r>
-                <m:t>x</m:t>
-              </m:r>
-            </m:num>
-            <m:den>
-              <m:r>
-                <m:t>d</m:t>
-              </m:r>
-              <m:r>
-                <m:t>t</m:t>
-              </m:r>
-            </m:den>
-          </m:f>
-          <m:r>
-            <m:rPr>
-              <m:sty m:val="p"/>
-            </m:rPr>
-            <m:t>=</m:t>
-          </m:r>
-          <m:r>
-            <m:rPr>
-              <m:sty m:val="p"/>
-            </m:rPr>
-            <m:t>−</m:t>
-          </m:r>
-          <m:r>
-            <m:t>a</m:t>
-          </m:r>
-          <m:r>
-            <m:t>x</m:t>
-          </m:r>
-          <m:r>
-            <m:rPr>
-              <m:sty m:val="p"/>
-            </m:rPr>
-            <m:t>−</m:t>
-          </m:r>
-          <m:r>
-            <m:t>b</m:t>
-          </m:r>
-          <m:r>
-            <m:t>x</m:t>
-          </m:r>
-          <m:r>
-            <m:t>y</m:t>
-          </m:r>
-          <m:r>
-            <m:rPr>
-              <m:sty m:val="p"/>
-            </m:rPr>
-            <m:t>+</m:t>
-          </m:r>
-          <m:r>
-            <m:t>P</m:t>
-          </m:r>
-          <m:d>
-            <m:dPr>
-              <m:begChr m:val="("/>
-              <m:sepChr m:val=""/>
-              <m:endChr m:val=")"/>
-              <m:grow/>
-            </m:dPr>
-            <m:e>
-              <m:r>
-                <m:t>t</m:t>
-              </m:r>
-            </m:e>
-          </m:d>
-          <m:r>
-            <m:rPr>
-              <m:sty m:val="p"/>
-            </m:rPr>
-            <m:t>,</m:t>
-          </m:r>
-          <m:r>
-            <m:t> </m:t>
-          </m:r>
-          <m:f>
-            <m:fPr>
-              <m:type m:val="bar"/>
-            </m:fPr>
-            <m:num>
-              <m:r>
-                <m:t>d</m:t>
-              </m:r>
-              <m:r>
-                <m:t>y</m:t>
-              </m:r>
-            </m:num>
-            <m:den>
-              <m:r>
-                <m:t>d</m:t>
-              </m:r>
-              <m:r>
-                <m:t>t</m:t>
-              </m:r>
-            </m:den>
-          </m:f>
-          <m:r>
-            <m:rPr>
-              <m:sty m:val="p"/>
-            </m:rPr>
-            <m:t>=</m:t>
-          </m:r>
-          <m:r>
-            <m:rPr>
-              <m:sty m:val="p"/>
-            </m:rPr>
-            <m:t>−</m:t>
-          </m:r>
-          <m:r>
-            <m:t>c</m:t>
-          </m:r>
-          <m:r>
-            <m:t>x</m:t>
-          </m:r>
-          <m:r>
-            <m:t>y</m:t>
-          </m:r>
-          <m:r>
-            <m:rPr>
-              <m:sty m:val="p"/>
-            </m:rPr>
-            <m:t>−</m:t>
-          </m:r>
-          <m:r>
-            <m:t>h</m:t>
-          </m:r>
-          <m:r>
-            <m:t>y</m:t>
-          </m:r>
-          <m:r>
-            <m:rPr>
-              <m:sty m:val="p"/>
-            </m:rPr>
-            <m:t>+</m:t>
-          </m:r>
-          <m:r>
-            <m:t>Q</m:t>
-          </m:r>
-          <m:d>
-            <m:dPr>
-              <m:begChr m:val="("/>
-              <m:sepChr m:val=""/>
-              <m:endChr m:val=")"/>
-              <m:grow/>
-            </m:dPr>
-            <m:e>
-              <m:r>
-                <m:t>t</m:t>
-              </m:r>
-            </m:e>
-          </m:d>
-        </m:oMath>
-      </m:oMathPara>
-    </w:p>
-    <w:p>
-      <w:pPr>
-        <w:pStyle w:val="FirstParagraph"/>
-      </w:pPr>
-      <w:r>
-        <w:t xml:space="preserve">Здесь:</w:t>
+        <w:t xml:space="preserve">DifferentialEquations.jl</w:t>
       </w:r>
       <w:r>
         <w:t xml:space="preserve"> </w:t>
       </w:r>
       <w:r>
-        <w:t xml:space="preserve">-</w:t>
+        <w:t xml:space="preserve">— решение ОДУ</w:t>
+      </w:r>
+    </w:p>
+    <w:p>
+      <w:pPr>
+        <w:pStyle w:val="Compact"/>
+        <w:numPr>
+          <w:ilvl w:val="0"/>
+          <w:numId w:val="1002"/>
+        </w:numPr>
+      </w:pPr>
+      <w:r>
+        <w:rPr>
+          <w:rStyle w:val="VerbatimChar"/>
+        </w:rPr>
+        <w:t xml:space="preserve">Plots.jl</w:t>
       </w:r>
       <w:r>
         <w:t xml:space="preserve"> </w:t>
       </w:r>
-      <m:oMath>
-        <m:r>
-          <m:t>a</m:t>
-        </m:r>
-        <m:r>
-          <m:rPr>
-            <m:sty m:val="p"/>
-          </m:rPr>
-          <m:t>,</m:t>
-        </m:r>
-        <m:r>
-          <m:t>h</m:t>
-        </m:r>
-      </m:oMath>
+      <w:r>
+        <w:t xml:space="preserve">— визуализация</w:t>
+      </w:r>
+    </w:p>
+    <w:p>
+      <w:pPr>
+        <w:pStyle w:val="Compact"/>
+        <w:numPr>
+          <w:ilvl w:val="0"/>
+          <w:numId w:val="1002"/>
+        </w:numPr>
+      </w:pPr>
+      <w:r>
+        <w:rPr>
+          <w:rStyle w:val="VerbatimChar"/>
+        </w:rPr>
+        <w:t xml:space="preserve">DrWatson.jl</w:t>
+      </w:r>
       <w:r>
         <w:t xml:space="preserve"> </w:t>
       </w:r>
       <w:r>
-        <w:t xml:space="preserve">— потери, не связанные с боевыми действиями;</w:t>
+        <w:t xml:space="preserve">— организация проекта</w:t>
+      </w:r>
+    </w:p>
+    <w:p>
+      <w:pPr>
+        <w:pStyle w:val="Compact"/>
+        <w:numPr>
+          <w:ilvl w:val="0"/>
+          <w:numId w:val="1002"/>
+        </w:numPr>
+      </w:pPr>
+      <w:r>
+        <w:rPr>
+          <w:rStyle w:val="VerbatimChar"/>
+        </w:rPr>
+        <w:t xml:space="preserve">Literate.jl</w:t>
       </w:r>
       <w:r>
         <w:t xml:space="preserve"> </w:t>
       </w:r>
       <w:r>
-        <w:t xml:space="preserve">-</w:t>
-      </w:r>
-      <w:r>
-        <w:t xml:space="preserve"> </w:t>
-      </w:r>
-      <m:oMath>
-        <m:r>
-          <m:t>b</m:t>
-        </m:r>
-        <m:r>
-          <m:rPr>
-            <m:sty m:val="p"/>
-          </m:rPr>
-          <m:t>,</m:t>
-        </m:r>
-        <m:r>
-          <m:t>c</m:t>
-        </m:r>
-      </m:oMath>
-      <w:r>
-        <w:t xml:space="preserve"> </w:t>
-      </w:r>
-      <w:r>
-        <w:t xml:space="preserve">— эффективность боевых действий противника;</w:t>
-      </w:r>
-      <w:r>
-        <w:t xml:space="preserve"> </w:t>
-      </w:r>
-      <w:r>
-        <w:t xml:space="preserve">-</w:t>
-      </w:r>
-      <w:r>
-        <w:t xml:space="preserve"> </w:t>
-      </w:r>
-      <m:oMath>
-        <m:r>
-          <m:t>P</m:t>
-        </m:r>
-        <m:d>
-          <m:dPr>
-            <m:begChr m:val="("/>
-            <m:sepChr m:val=""/>
-            <m:endChr m:val=")"/>
-            <m:grow/>
-          </m:dPr>
-          <m:e>
-            <m:r>
-              <m:t>t</m:t>
-            </m:r>
-          </m:e>
-        </m:d>
-        <m:r>
-          <m:rPr>
-            <m:sty m:val="p"/>
-          </m:rPr>
-          <m:t>,</m:t>
-        </m:r>
-        <m:r>
-          <m:t>Q</m:t>
-        </m:r>
-        <m:d>
-          <m:dPr>
-            <m:begChr m:val="("/>
-            <m:sepChr m:val=""/>
-            <m:endChr m:val=")"/>
-            <m:grow/>
-          </m:dPr>
-          <m:e>
-            <m:r>
-              <m:t>t</m:t>
-            </m:r>
-          </m:e>
-        </m:d>
-      </m:oMath>
-      <w:r>
-        <w:t xml:space="preserve"> </w:t>
-      </w:r>
-      <w:r>
-        <w:t xml:space="preserve">— функции подкрепления.</w:t>
-      </w:r>
-    </w:p>
-    <w:bookmarkEnd w:id="26"/>
-    <w:bookmarkStart w:id="27" w:name="простейший-случай-без-подкреплений"/>
+        <w:t xml:space="preserve">— литературное программирование</w:t>
+      </w:r>
+    </w:p>
+    <w:bookmarkStart w:id="28" w:name="параметры-задачи-вариант-38"/>
     <w:p>
       <w:pPr>
         <w:pStyle w:val="Heading2"/>
       </w:pPr>
       <w:r>
-        <w:t xml:space="preserve">2.2 Простейший случай без подкреплений</w:t>
-      </w:r>
-    </w:p>
-    <w:p>
-      <w:pPr>
-        <w:pStyle w:val="FirstParagraph"/>
-      </w:pPr>
-      <w:r>
-        <w:t xml:space="preserve">При</w:t>
-      </w:r>
-      <w:r>
-        <w:t xml:space="preserve"> </w:t>
-      </w:r>
-      <m:oMath>
-        <m:r>
-          <m:t>a</m:t>
-        </m:r>
-        <m:r>
-          <m:rPr>
-            <m:sty m:val="p"/>
-          </m:rPr>
-          <m:t>=</m:t>
-        </m:r>
-        <m:r>
-          <m:t>h</m:t>
-        </m:r>
-        <m:r>
-          <m:rPr>
-            <m:sty m:val="p"/>
-          </m:rPr>
-          <m:t>=</m:t>
-        </m:r>
-        <m:r>
-          <m:t>P</m:t>
-        </m:r>
-        <m:r>
-          <m:rPr>
-            <m:sty m:val="p"/>
-          </m:rPr>
-          <m:t>=</m:t>
-        </m:r>
-        <m:r>
-          <m:t>Q</m:t>
-        </m:r>
-        <m:r>
-          <m:rPr>
-            <m:sty m:val="p"/>
-          </m:rPr>
-          <m:t>=</m:t>
-        </m:r>
-        <m:r>
-          <m:t>0</m:t>
-        </m:r>
-      </m:oMath>
-      <w:r>
-        <w:t xml:space="preserve"> </w:t>
-      </w:r>
-      <w:r>
-        <w:t xml:space="preserve">первая модель сводится к:</w:t>
-      </w:r>
-    </w:p>
-    <w:p>
-      <w:pPr>
-        <w:pStyle w:val="BodyText"/>
-      </w:pPr>
-      <m:oMathPara>
-        <m:oMathParaPr>
-          <m:jc m:val="center"/>
-        </m:oMathParaPr>
-        <m:oMath>
-          <m:acc>
-            <m:accPr>
-              <m:chr m:val="̇"/>
-            </m:accPr>
-            <m:e>
-              <m:r>
-                <m:t>x</m:t>
-              </m:r>
-            </m:e>
-          </m:acc>
-          <m:r>
-            <m:rPr>
-              <m:sty m:val="p"/>
-            </m:rPr>
-            <m:t>=</m:t>
-          </m:r>
-          <m:r>
-            <m:rPr>
-              <m:sty m:val="p"/>
-            </m:rPr>
-            <m:t>−</m:t>
-          </m:r>
-          <m:r>
-            <m:t>b</m:t>
-          </m:r>
-          <m:r>
-            <m:t>y</m:t>
-          </m:r>
-          <m:r>
-            <m:rPr>
-              <m:sty m:val="p"/>
-            </m:rPr>
-            <m:t>,</m:t>
-          </m:r>
-          <m:r>
-            <m:t> </m:t>
-          </m:r>
-          <m:acc>
-            <m:accPr>
-              <m:chr m:val="̇"/>
-            </m:accPr>
-            <m:e>
-              <m:r>
-                <m:t>y</m:t>
-              </m:r>
-            </m:e>
-          </m:acc>
-          <m:r>
-            <m:rPr>
-              <m:sty m:val="p"/>
-            </m:rPr>
-            <m:t>=</m:t>
-          </m:r>
-          <m:r>
-            <m:rPr>
-              <m:sty m:val="p"/>
-            </m:rPr>
-            <m:t>−</m:t>
-          </m:r>
-          <m:r>
-            <m:t>c</m:t>
-          </m:r>
-          <m:r>
-            <m:t>x</m:t>
-          </m:r>
-        </m:oMath>
-      </m:oMathPara>
-    </w:p>
-    <w:p>
-      <w:pPr>
-        <w:pStyle w:val="FirstParagraph"/>
-      </w:pPr>
-      <w:r>
-        <w:t xml:space="preserve">что даёт интеграл движения</w:t>
-      </w:r>
-      <w:r>
-        <w:t xml:space="preserve"> </w:t>
-      </w:r>
-      <m:oMath>
-        <m:r>
-          <m:t>c</m:t>
-        </m:r>
-        <m:sSup>
-          <m:e>
-            <m:r>
-              <m:t>x</m:t>
-            </m:r>
-          </m:e>
-          <m:sup>
-            <m:r>
-              <m:t>2</m:t>
-            </m:r>
-          </m:sup>
-        </m:sSup>
-        <m:r>
-          <m:rPr>
-            <m:sty m:val="p"/>
-          </m:rPr>
-          <m:t>−</m:t>
-        </m:r>
-        <m:r>
-          <m:t>b</m:t>
-        </m:r>
-        <m:sSup>
-          <m:e>
-            <m:r>
-              <m:t>y</m:t>
-            </m:r>
-          </m:e>
-          <m:sup>
-            <m:r>
-              <m:t>2</m:t>
-            </m:r>
-          </m:sup>
-        </m:sSup>
-        <m:r>
-          <m:rPr>
-            <m:sty m:val="p"/>
-          </m:rPr>
-          <m:t>=</m:t>
-        </m:r>
-        <m:r>
-          <m:t>C</m:t>
-        </m:r>
-      </m:oMath>
-      <w:r>
-        <w:t xml:space="preserve"> </w:t>
-      </w:r>
-      <w:r>
-        <w:t xml:space="preserve">(гиперболы фазового портрета).</w:t>
-      </w:r>
-    </w:p>
-    <w:bookmarkEnd w:id="27"/>
-    <w:bookmarkEnd w:id="28"/>
-    <w:bookmarkStart w:id="30" w:name="материалы-и-методы"/>
-    <w:p>
-      <w:pPr>
-        <w:pStyle w:val="Heading1"/>
-      </w:pPr>
-      <w:r>
-        <w:t xml:space="preserve">3. Материалы и методы</w:t>
-      </w:r>
-    </w:p>
-    <w:p>
-      <w:pPr>
-        <w:pStyle w:val="FirstParagraph"/>
-      </w:pPr>
-      <w:r>
-        <w:t xml:space="preserve">Работа выполнена на языке Julia 1.13 с пакетами:</w:t>
+        <w:t xml:space="preserve">3.1 Параметры задачи (вариант 38)</w:t>
       </w:r>
     </w:p>
     <w:p>
@@ -1246,182 +801,6 @@
         <w:numPr>
           <w:ilvl w:val="0"/>
           <w:numId w:val="1003"/>
-        </w:numPr>
-      </w:pPr>
-      <w:r>
-        <w:rPr>
-          <w:rStyle w:val="VerbatimChar"/>
-        </w:rPr>
-        <w:t xml:space="preserve">DifferentialEquations.jl</w:t>
-      </w:r>
-      <w:r>
-        <w:t xml:space="preserve"> </w:t>
-      </w:r>
-      <w:r>
-        <w:t xml:space="preserve">— решение ОДУ</w:t>
-      </w:r>
-    </w:p>
-    <w:p>
-      <w:pPr>
-        <w:pStyle w:val="Compact"/>
-        <w:numPr>
-          <w:ilvl w:val="0"/>
-          <w:numId w:val="1003"/>
-        </w:numPr>
-      </w:pPr>
-      <w:r>
-        <w:rPr>
-          <w:rStyle w:val="VerbatimChar"/>
-        </w:rPr>
-        <w:t xml:space="preserve">Plots.jl</w:t>
-      </w:r>
-      <w:r>
-        <w:t xml:space="preserve"> </w:t>
-      </w:r>
-      <w:r>
-        <w:t xml:space="preserve">— визуализация</w:t>
-      </w:r>
-    </w:p>
-    <w:p>
-      <w:pPr>
-        <w:pStyle w:val="Compact"/>
-        <w:numPr>
-          <w:ilvl w:val="0"/>
-          <w:numId w:val="1003"/>
-        </w:numPr>
-      </w:pPr>
-      <w:r>
-        <w:rPr>
-          <w:rStyle w:val="VerbatimChar"/>
-        </w:rPr>
-        <w:t xml:space="preserve">DrWatson.jl</w:t>
-      </w:r>
-      <w:r>
-        <w:t xml:space="preserve"> </w:t>
-      </w:r>
-      <w:r>
-        <w:t xml:space="preserve">— организация проекта</w:t>
-      </w:r>
-    </w:p>
-    <w:p>
-      <w:pPr>
-        <w:pStyle w:val="Compact"/>
-        <w:numPr>
-          <w:ilvl w:val="0"/>
-          <w:numId w:val="1003"/>
-        </w:numPr>
-      </w:pPr>
-      <w:r>
-        <w:rPr>
-          <w:rStyle w:val="VerbatimChar"/>
-        </w:rPr>
-        <w:t xml:space="preserve">Literate.jl</w:t>
-      </w:r>
-      <w:r>
-        <w:t xml:space="preserve"> </w:t>
-      </w:r>
-      <w:r>
-        <w:t xml:space="preserve">— литературное программирование</w:t>
-      </w:r>
-    </w:p>
-    <w:bookmarkStart w:id="29" w:name="параметры-задачи"/>
-    <w:p>
-      <w:pPr>
-        <w:pStyle w:val="Heading2"/>
-      </w:pPr>
-      <w:r>
-        <w:t xml:space="preserve">3.1 Параметры задачи</w:t>
-      </w:r>
-    </w:p>
-    <w:p>
-      <w:pPr>
-        <w:pStyle w:val="Compact"/>
-        <w:numPr>
-          <w:ilvl w:val="0"/>
-          <w:numId w:val="1004"/>
-        </w:numPr>
-      </w:pPr>
-      <m:oMath>
-        <m:r>
-          <m:t>a</m:t>
-        </m:r>
-        <m:r>
-          <m:rPr>
-            <m:sty m:val="p"/>
-          </m:rPr>
-          <m:t>=</m:t>
-        </m:r>
-        <m:r>
-          <m:t>0.4</m:t>
-        </m:r>
-      </m:oMath>
-      <w:r>
-        <w:t xml:space="preserve">,</w:t>
-      </w:r>
-      <w:r>
-        <w:t xml:space="preserve"> </w:t>
-      </w:r>
-      <m:oMath>
-        <m:r>
-          <m:t>b</m:t>
-        </m:r>
-        <m:r>
-          <m:rPr>
-            <m:sty m:val="p"/>
-          </m:rPr>
-          <m:t>=</m:t>
-        </m:r>
-        <m:r>
-          <m:t>0.8</m:t>
-        </m:r>
-      </m:oMath>
-      <w:r>
-        <w:t xml:space="preserve">,</w:t>
-      </w:r>
-      <w:r>
-        <w:t xml:space="preserve"> </w:t>
-      </w:r>
-      <m:oMath>
-        <m:r>
-          <m:t>c</m:t>
-        </m:r>
-        <m:r>
-          <m:rPr>
-            <m:sty m:val="p"/>
-          </m:rPr>
-          <m:t>=</m:t>
-        </m:r>
-        <m:r>
-          <m:t>0.5</m:t>
-        </m:r>
-      </m:oMath>
-      <w:r>
-        <w:t xml:space="preserve">,</w:t>
-      </w:r>
-      <w:r>
-        <w:t xml:space="preserve"> </w:t>
-      </w:r>
-      <m:oMath>
-        <m:r>
-          <m:t>h</m:t>
-        </m:r>
-        <m:r>
-          <m:rPr>
-            <m:sty m:val="p"/>
-          </m:rPr>
-          <m:t>=</m:t>
-        </m:r>
-        <m:r>
-          <m:t>0.7</m:t>
-        </m:r>
-      </m:oMath>
-    </w:p>
-    <w:p>
-      <w:pPr>
-        <w:pStyle w:val="Compact"/>
-        <w:numPr>
-          <w:ilvl w:val="0"/>
-          <w:numId w:val="1004"/>
         </w:numPr>
       </w:pPr>
       <w:r>
@@ -1450,7 +829,7 @@
           <m:t>=</m:t>
         </m:r>
         <m:r>
-          <m:t>20000</m:t>
+          <m:t>882000</m:t>
         </m:r>
       </m:oMath>
       <w:r>
@@ -1479,7 +858,7 @@
           <m:t>=</m:t>
         </m:r>
         <m:r>
-          <m:t>9000</m:t>
+          <m:t>747000</m:t>
         </m:r>
       </m:oMath>
     </w:p>
@@ -1488,112 +867,7 @@
         <w:pStyle w:val="Compact"/>
         <w:numPr>
           <w:ilvl w:val="0"/>
-          <w:numId w:val="1004"/>
-        </w:numPr>
-      </w:pPr>
-      <w:r>
-        <w:t xml:space="preserve">Функции подкрепления:</w:t>
-      </w:r>
-      <w:r>
-        <w:t xml:space="preserve"> </w:t>
-      </w:r>
-      <m:oMath>
-        <m:r>
-          <m:t>P</m:t>
-        </m:r>
-        <m:d>
-          <m:dPr>
-            <m:begChr m:val="("/>
-            <m:sepChr m:val=""/>
-            <m:endChr m:val=")"/>
-            <m:grow/>
-          </m:dPr>
-          <m:e>
-            <m:r>
-              <m:t>t</m:t>
-            </m:r>
-          </m:e>
-        </m:d>
-        <m:r>
-          <m:rPr>
-            <m:sty m:val="p"/>
-          </m:rPr>
-          <m:t>=</m:t>
-        </m:r>
-        <m:r>
-          <m:rPr>
-            <m:sty m:val="p"/>
-          </m:rPr>
-          <m:t>sin</m:t>
-        </m:r>
-        <m:r>
-          <m:t>t</m:t>
-        </m:r>
-        <m:r>
-          <m:rPr>
-            <m:sty m:val="p"/>
-          </m:rPr>
-          <m:t>+</m:t>
-        </m:r>
-        <m:r>
-          <m:t>1</m:t>
-        </m:r>
-      </m:oMath>
-      <w:r>
-        <w:t xml:space="preserve">,</w:t>
-      </w:r>
-      <w:r>
-        <w:t xml:space="preserve"> </w:t>
-      </w:r>
-      <m:oMath>
-        <m:r>
-          <m:t>Q</m:t>
-        </m:r>
-        <m:d>
-          <m:dPr>
-            <m:begChr m:val="("/>
-            <m:sepChr m:val=""/>
-            <m:endChr m:val=")"/>
-            <m:grow/>
-          </m:dPr>
-          <m:e>
-            <m:r>
-              <m:t>t</m:t>
-            </m:r>
-          </m:e>
-        </m:d>
-        <m:r>
-          <m:rPr>
-            <m:sty m:val="p"/>
-          </m:rPr>
-          <m:t>=</m:t>
-        </m:r>
-        <m:r>
-          <m:rPr>
-            <m:sty m:val="p"/>
-          </m:rPr>
-          <m:t>cos</m:t>
-        </m:r>
-        <m:r>
-          <m:t>t</m:t>
-        </m:r>
-        <m:r>
-          <m:rPr>
-            <m:sty m:val="p"/>
-          </m:rPr>
-          <m:t>+</m:t>
-        </m:r>
-        <m:r>
-          <m:t>1</m:t>
-        </m:r>
-      </m:oMath>
-    </w:p>
-    <w:p>
-      <w:pPr>
-        <w:pStyle w:val="Compact"/>
-        <w:numPr>
-          <w:ilvl w:val="0"/>
-          <w:numId w:val="1004"/>
+          <w:numId w:val="1003"/>
         </w:numPr>
       </w:pPr>
       <w:r>
@@ -1630,15 +904,15 @@
               <m:t>,</m:t>
             </m:r>
             <m:r>
-              <m:t>1</m:t>
+              <m:t>5</m:t>
             </m:r>
           </m:e>
         </m:d>
       </m:oMath>
     </w:p>
+    <w:bookmarkEnd w:id="28"/>
     <w:bookmarkEnd w:id="29"/>
-    <w:bookmarkEnd w:id="30"/>
-    <w:bookmarkStart w:id="51" w:name="выполнение-лабораторной-работы"/>
+    <w:bookmarkStart w:id="45" w:name="выполнение-лабораторной-работы"/>
     <w:p>
       <w:pPr>
         <w:pStyle w:val="Heading1"/>
@@ -1647,13 +921,13 @@
         <w:t xml:space="preserve">4. Выполнение лабораторной работы</w:t>
       </w:r>
     </w:p>
-    <w:bookmarkStart w:id="35" w:name="Xe81ccfc35ba8c8aa99ff4f6101eb7179e8586d1"/>
+    <w:bookmarkStart w:id="34" w:name="модель-1-регулярные-vs-регулярные-1"/>
     <w:p>
       <w:pPr>
         <w:pStyle w:val="Heading2"/>
       </w:pPr>
       <w:r>
-        <w:t xml:space="preserve">4.1 Модель 1: регулярные войска против регулярных</w:t>
+        <w:t xml:space="preserve">4.1 Модель 1: регулярные vs регулярные</w:t>
       </w:r>
     </w:p>
     <w:tbl>
@@ -1669,7 +943,7 @@
       <w:tr>
         <w:tc>
           <w:tcPr/>
-          <w:bookmarkStart w:id="34" w:name="fig-battle1"/>
+          <w:bookmarkStart w:id="33" w:name="fig-battle1"/>
           <w:p>
             <w:pPr>
               <w:pStyle w:val="Compact"/>
@@ -1678,20 +952,20 @@
             <w:r>
               <w:drawing>
                 <wp:inline>
-                  <wp:extent cx="4267200" cy="2844800"/>
+                  <wp:extent cx="4800600" cy="3200400"/>
                   <wp:effectExtent b="0" l="0" r="0" t="0"/>
-                  <wp:docPr descr="" title="" id="32" name="Picture"/>
+                  <wp:docPr descr="" title="" id="31" name="Picture"/>
                   <a:graphic>
                     <a:graphicData uri="http://schemas.openxmlformats.org/drawingml/2006/picture">
                       <pic:pic>
                         <pic:nvPicPr>
-                          <pic:cNvPr descr="image/battle1.png" id="33" name="Picture"/>
+                          <pic:cNvPr descr="image/battle1.png" id="32" name="Picture"/>
                           <pic:cNvPicPr>
                             <a:picLocks noChangeArrowheads="1" noChangeAspect="1"/>
                           </pic:cNvPicPr>
                         </pic:nvPicPr>
                         <pic:blipFill>
-                          <a:blip r:embed="rId31"/>
+                          <a:blip r:embed="rId30"/>
                           <a:stretch>
                             <a:fillRect/>
                           </a:stretch>
@@ -1699,7 +973,7 @@
                         <pic:spPr bwMode="auto">
                           <a:xfrm>
                             <a:off x="0" y="0"/>
-                            <a:ext cx="4267200" cy="2844800"/>
+                            <a:ext cx="4800600" cy="3200400"/>
                           </a:xfrm>
                           <a:prstGeom prst="rect">
                             <a:avLst/>
@@ -1731,18 +1005,18 @@
               <w:t xml:space="preserve">Рисунок 1: Модель 1: регулярные vs регулярные</w:t>
             </w:r>
           </w:p>
-          <w:bookmarkEnd w:id="34"/>
+          <w:bookmarkEnd w:id="33"/>
         </w:tc>
       </w:tr>
     </w:tbl>
-    <w:bookmarkEnd w:id="35"/>
-    <w:bookmarkStart w:id="40" w:name="X481d10ddde1bf1b6296b1edc9c54bd362c5b31c"/>
+    <w:bookmarkEnd w:id="34"/>
+    <w:bookmarkStart w:id="39" w:name="модель-2-регулярные-vs-партизаны-1"/>
     <w:p>
       <w:pPr>
         <w:pStyle w:val="Heading2"/>
       </w:pPr>
       <w:r>
-        <w:t xml:space="preserve">4.2 Модель 2: регулярные войска против партизан</w:t>
+        <w:t xml:space="preserve">4.2 Модель 2: регулярные vs партизаны</w:t>
       </w:r>
     </w:p>
     <w:tbl>
@@ -1758,7 +1032,7 @@
       <w:tr>
         <w:tc>
           <w:tcPr/>
-          <w:bookmarkStart w:id="39" w:name="fig-battle2"/>
+          <w:bookmarkStart w:id="38" w:name="fig-battle2"/>
           <w:p>
             <w:pPr>
               <w:pStyle w:val="Compact"/>
@@ -1767,20 +1041,20 @@
             <w:r>
               <w:drawing>
                 <wp:inline>
-                  <wp:extent cx="4267200" cy="2844800"/>
+                  <wp:extent cx="4800600" cy="3200400"/>
                   <wp:effectExtent b="0" l="0" r="0" t="0"/>
-                  <wp:docPr descr="" title="" id="37" name="Picture"/>
+                  <wp:docPr descr="" title="" id="36" name="Picture"/>
                   <a:graphic>
                     <a:graphicData uri="http://schemas.openxmlformats.org/drawingml/2006/picture">
                       <pic:pic>
                         <pic:nvPicPr>
-                          <pic:cNvPr descr="image/battle2.png" id="38" name="Picture"/>
+                          <pic:cNvPr descr="image/battle2.png" id="37" name="Picture"/>
                           <pic:cNvPicPr>
                             <a:picLocks noChangeArrowheads="1" noChangeAspect="1"/>
                           </pic:cNvPicPr>
                         </pic:nvPicPr>
                         <pic:blipFill>
-                          <a:blip r:embed="rId36"/>
+                          <a:blip r:embed="rId35"/>
                           <a:stretch>
                             <a:fillRect/>
                           </a:stretch>
@@ -1788,7 +1062,7 @@
                         <pic:spPr bwMode="auto">
                           <a:xfrm>
                             <a:off x="0" y="0"/>
-                            <a:ext cx="4267200" cy="2844800"/>
+                            <a:ext cx="4800600" cy="3200400"/>
                           </a:xfrm>
                           <a:prstGeom prst="rect">
                             <a:avLst/>
@@ -1820,18 +1094,18 @@
               <w:t xml:space="preserve">Рисунок 2: Модель 2: регулярные vs партизаны</w:t>
             </w:r>
           </w:p>
-          <w:bookmarkEnd w:id="39"/>
+          <w:bookmarkEnd w:id="38"/>
         </w:tc>
       </w:tr>
     </w:tbl>
-    <w:bookmarkEnd w:id="40"/>
-    <w:bookmarkStart w:id="45" w:name="модель-3-партизаны-против-партизан"/>
+    <w:bookmarkEnd w:id="39"/>
+    <w:bookmarkStart w:id="44" w:name="сводный-график"/>
     <w:p>
       <w:pPr>
         <w:pStyle w:val="Heading2"/>
       </w:pPr>
       <w:r>
-        <w:t xml:space="preserve">4.3 Модель 3: партизаны против партизан</w:t>
+        <w:t xml:space="preserve">4.3 Сводный график</w:t>
       </w:r>
     </w:p>
     <w:tbl>
@@ -1847,7 +1121,7 @@
       <w:tr>
         <w:tc>
           <w:tcPr/>
-          <w:bookmarkStart w:id="44" w:name="fig-battle3"/>
+          <w:bookmarkStart w:id="43" w:name="fig-all"/>
           <w:p>
             <w:pPr>
               <w:pStyle w:val="Compact"/>
@@ -1856,20 +1130,20 @@
             <w:r>
               <w:drawing>
                 <wp:inline>
-                  <wp:extent cx="4267200" cy="2844800"/>
+                  <wp:extent cx="4800600" cy="4267200"/>
                   <wp:effectExtent b="0" l="0" r="0" t="0"/>
-                  <wp:docPr descr="" title="" id="42" name="Picture"/>
+                  <wp:docPr descr="" title="" id="41" name="Picture"/>
                   <a:graphic>
                     <a:graphicData uri="http://schemas.openxmlformats.org/drawingml/2006/picture">
                       <pic:pic>
                         <pic:nvPicPr>
-                          <pic:cNvPr descr="image/battle3.png" id="43" name="Picture"/>
+                          <pic:cNvPr descr="image/battles_all.png" id="42" name="Picture"/>
                           <pic:cNvPicPr>
                             <a:picLocks noChangeArrowheads="1" noChangeAspect="1"/>
                           </pic:cNvPicPr>
                         </pic:nvPicPr>
                         <pic:blipFill>
-                          <a:blip r:embed="rId41"/>
+                          <a:blip r:embed="rId40"/>
                           <a:stretch>
                             <a:fillRect/>
                           </a:stretch>
@@ -1877,7 +1151,7 @@
                         <pic:spPr bwMode="auto">
                           <a:xfrm>
                             <a:off x="0" y="0"/>
-                            <a:ext cx="4267200" cy="2844800"/>
+                            <a:ext cx="4800600" cy="4267200"/>
                           </a:xfrm>
                           <a:prstGeom prst="rect">
                             <a:avLst/>
@@ -1906,105 +1180,16 @@
               <w:pStyle w:val="ImageCaption"/>
             </w:pPr>
             <w:r>
-              <w:t xml:space="preserve">Рисунок 3: Модель 3: партизаны vs партизаны</w:t>
+              <w:t xml:space="preserve">Рисунок 3: Сводный график</w:t>
             </w:r>
           </w:p>
-          <w:bookmarkEnd w:id="44"/>
+          <w:bookmarkEnd w:id="43"/>
         </w:tc>
       </w:tr>
     </w:tbl>
+    <w:bookmarkEnd w:id="44"/>
     <w:bookmarkEnd w:id="45"/>
-    <w:bookmarkStart w:id="50" w:name="сводный-график"/>
-    <w:p>
-      <w:pPr>
-        <w:pStyle w:val="Heading2"/>
-      </w:pPr>
-      <w:r>
-        <w:t xml:space="preserve">4.4 Сводный график</w:t>
-      </w:r>
-    </w:p>
-    <w:tbl>
-      <w:tblPr>
-        <w:tblStyle w:val="Table"/>
-        <w:tblW w:type="pct" w:w="5000"/>
-        <w:tblLayout w:type="fixed"/>
-        <w:tblLook w:firstRow="0" w:lastRow="0" w:firstColumn="0" w:lastColumn="0" w:noHBand="0" w:noVBand="0" w:val="0000"/>
-      </w:tblPr>
-      <w:tblGrid>
-        <w:gridCol w:w="7920"/>
-      </w:tblGrid>
-      <w:tr>
-        <w:tc>
-          <w:tcPr/>
-          <w:bookmarkStart w:id="49" w:name="fig-all"/>
-          <w:p>
-            <w:pPr>
-              <w:pStyle w:val="Compact"/>
-              <w:jc w:val="center"/>
-            </w:pPr>
-            <w:r>
-              <w:drawing>
-                <wp:inline>
-                  <wp:extent cx="4267200" cy="4742389"/>
-                  <wp:effectExtent b="0" l="0" r="0" t="0"/>
-                  <wp:docPr descr="" title="" id="47" name="Picture"/>
-                  <a:graphic>
-                    <a:graphicData uri="http://schemas.openxmlformats.org/drawingml/2006/picture">
-                      <pic:pic>
-                        <pic:nvPicPr>
-                          <pic:cNvPr descr="image/battles_all.png" id="48" name="Picture"/>
-                          <pic:cNvPicPr>
-                            <a:picLocks noChangeArrowheads="1" noChangeAspect="1"/>
-                          </pic:cNvPicPr>
-                        </pic:nvPicPr>
-                        <pic:blipFill>
-                          <a:blip r:embed="rId46"/>
-                          <a:stretch>
-                            <a:fillRect/>
-                          </a:stretch>
-                        </pic:blipFill>
-                        <pic:spPr bwMode="auto">
-                          <a:xfrm>
-                            <a:off x="0" y="0"/>
-                            <a:ext cx="4267200" cy="4742389"/>
-                          </a:xfrm>
-                          <a:prstGeom prst="rect">
-                            <a:avLst/>
-                          </a:prstGeom>
-                          <a:noFill/>
-                          <a:ln w="9525">
-                            <a:noFill/>
-                            <a:headEnd/>
-                            <a:tailEnd/>
-                          </a:ln>
-                        </pic:spPr>
-                      </pic:pic>
-                    </a:graphicData>
-                  </a:graphic>
-                </wp:inline>
-              </w:drawing>
-            </w:r>
-          </w:p>
-          <w:p>
-            <w:pPr>
-              <w:jc w:val="center"/>
-            </w:pPr>
-            <w:pPr>
-              <w:jc w:val="left"/>
-              <w:spacing w:before="200"/>
-              <w:pStyle w:val="ImageCaption"/>
-            </w:pPr>
-            <w:r>
-              <w:t xml:space="preserve">Рисунок 4: Все три модели</w:t>
-            </w:r>
-          </w:p>
-          <w:bookmarkEnd w:id="49"/>
-        </w:tc>
-      </w:tr>
-    </w:tbl>
-    <w:bookmarkEnd w:id="50"/>
-    <w:bookmarkEnd w:id="51"/>
-    <w:bookmarkStart w:id="52" w:name="результаты"/>
+    <w:bookmarkStart w:id="46" w:name="результаты"/>
     <w:p>
       <w:pPr>
         <w:pStyle w:val="Heading1"/>
@@ -2018,7 +1203,94 @@
         <w:pStyle w:val="FirstParagraph"/>
       </w:pPr>
       <w:r>
-        <w:t xml:space="preserve">В ходе численного решения получены следующие финальные численности:</w:t>
+        <w:t xml:space="preserve">По результатам численного решения определены финальные численности</w:t>
+      </w:r>
+      <w:r>
+        <w:t xml:space="preserve"> </w:t>
+      </w:r>
+      <w:r>
+        <w:t xml:space="preserve">сторон для каждой модели. Победитель определяется по большей остаточной</w:t>
+      </w:r>
+      <w:r>
+        <w:t xml:space="preserve"> </w:t>
+      </w:r>
+      <w:r>
+        <w:t xml:space="preserve">численности на момент окончания моделирования.</w:t>
+      </w:r>
+    </w:p>
+    <w:bookmarkEnd w:id="46"/>
+    <w:bookmarkStart w:id="47" w:name="обсуждение-результатов"/>
+    <w:p>
+      <w:pPr>
+        <w:pStyle w:val="Heading1"/>
+      </w:pPr>
+      <w:r>
+        <w:t xml:space="preserve">6. Обсуждение результатов</w:t>
+      </w:r>
+    </w:p>
+    <w:p>
+      <w:pPr>
+        <w:pStyle w:val="FirstParagraph"/>
+      </w:pPr>
+      <w:r>
+        <w:t xml:space="preserve">Модели Ланчестера показывают, что:</w:t>
+      </w:r>
+    </w:p>
+    <w:p>
+      <w:pPr>
+        <w:pStyle w:val="Compact"/>
+        <w:numPr>
+          <w:ilvl w:val="0"/>
+          <w:numId w:val="1004"/>
+        </w:numPr>
+      </w:pPr>
+      <w:r>
+        <w:t xml:space="preserve">В бою между регулярными войсками преимущество определяется</w:t>
+      </w:r>
+      <w:r>
+        <w:t xml:space="preserve"> </w:t>
+      </w:r>
+      <w:r>
+        <w:t xml:space="preserve">начальной численностью и коэффициентами эффективности.</w:t>
+      </w:r>
+    </w:p>
+    <w:p>
+      <w:pPr>
+        <w:pStyle w:val="Compact"/>
+        <w:numPr>
+          <w:ilvl w:val="0"/>
+          <w:numId w:val="1004"/>
+        </w:numPr>
+      </w:pPr>
+      <w:r>
+        <w:t xml:space="preserve">Против партизан регулярной армии сложнее: партизанская модель</w:t>
+      </w:r>
+      <w:r>
+        <w:t xml:space="preserve"> </w:t>
+      </w:r>
+      <w:r>
+        <w:t xml:space="preserve">учитывает квадратичный эффект (</w:t>
+      </w:r>
+      <m:oMath>
+        <m:r>
+          <m:t>x</m:t>
+        </m:r>
+        <m:r>
+          <m:t>y</m:t>
+        </m:r>
+      </m:oMath>
+      <w:r>
+        <w:t xml:space="preserve">).</w:t>
+      </w:r>
+    </w:p>
+    <w:bookmarkEnd w:id="47"/>
+    <w:bookmarkStart w:id="48" w:name="заключение"/>
+    <w:p>
+      <w:pPr>
+        <w:pStyle w:val="Heading1"/>
+      </w:pPr>
+      <w:r>
+        <w:t xml:space="preserve">7. Заключение</w:t>
       </w:r>
     </w:p>
     <w:p>
@@ -2030,14 +1302,7 @@
         </w:numPr>
       </w:pPr>
       <w:r>
-        <w:rPr>
-          <w:b/>
-          <w:bCs/>
-        </w:rPr>
-        <w:t xml:space="preserve">Модель 1</w:t>
-      </w:r>
-      <w:r>
-        <w:t xml:space="preserve">: победа X (более высокая начальная численность).</w:t>
+        <w:t xml:space="preserve">Решены две модели Ланчестера для варианта 38.</w:t>
       </w:r>
     </w:p>
     <w:p>
@@ -2049,54 +1314,7 @@
         </w:numPr>
       </w:pPr>
       <w:r>
-        <w:rPr>
-          <w:b/>
-          <w:bCs/>
-        </w:rPr>
-        <w:t xml:space="preserve">Модель 2</w:t>
-      </w:r>
-      <w:r>
-        <w:t xml:space="preserve">: зависит от соотношения</w:t>
-      </w:r>
-      <w:r>
-        <w:t xml:space="preserve"> </w:t>
-      </w:r>
-      <m:oMath>
-        <m:r>
-          <m:t>b</m:t>
-        </m:r>
-        <m:sSup>
-          <m:e>
-            <m:r>
-              <m:t>x</m:t>
-            </m:r>
-          </m:e>
-          <m:sup>
-            <m:r>
-              <m:t>2</m:t>
-            </m:r>
-          </m:sup>
-        </m:sSup>
-      </m:oMath>
-      <w:r>
-        <w:t xml:space="preserve"> </w:t>
-      </w:r>
-      <w:r>
-        <w:t xml:space="preserve">и</w:t>
-      </w:r>
-      <w:r>
-        <w:t xml:space="preserve"> </w:t>
-      </w:r>
-      <m:oMath>
-        <m:r>
-          <m:t>c</m:t>
-        </m:r>
-        <m:r>
-          <m:t>y</m:t>
-        </m:r>
-      </m:oMath>
-      <w:r>
-        <w:t xml:space="preserve">.</w:t>
+        <w:t xml:space="preserve">Построены графики динамики численностей сторон.</w:t>
       </w:r>
     </w:p>
     <w:p>
@@ -2108,276 +1326,22 @@
         </w:numPr>
       </w:pPr>
       <w:r>
-        <w:rPr>
-          <w:b/>
-          <w:bCs/>
-        </w:rPr>
-        <w:t xml:space="preserve">Модель 3</w:t>
-      </w:r>
-      <w:r>
-        <w:t xml:space="preserve">: зависит от коэффициентов</w:t>
-      </w:r>
-      <w:r>
-        <w:t xml:space="preserve"> </w:t>
-      </w:r>
-      <m:oMath>
-        <m:r>
-          <m:t>b</m:t>
-        </m:r>
-      </m:oMath>
-      <w:r>
-        <w:t xml:space="preserve"> </w:t>
-      </w:r>
-      <w:r>
-        <w:t xml:space="preserve">и</w:t>
-      </w:r>
-      <w:r>
-        <w:t xml:space="preserve"> </w:t>
-      </w:r>
-      <m:oMath>
-        <m:r>
-          <m:t>c</m:t>
-        </m:r>
-      </m:oMath>
-      <w:r>
-        <w:t xml:space="preserve">.</w:t>
-      </w:r>
-    </w:p>
-    <w:bookmarkEnd w:id="52"/>
-    <w:bookmarkStart w:id="53" w:name="обсуждение-результатов"/>
+        <w:t xml:space="preserve">Определены победители в каждой модели.</w:t>
+      </w:r>
+    </w:p>
+    <w:bookmarkEnd w:id="48"/>
+    <w:bookmarkStart w:id="50" w:name="список-литературы"/>
     <w:p>
       <w:pPr>
         <w:pStyle w:val="Heading1"/>
       </w:pPr>
       <w:r>
-        <w:t xml:space="preserve">6. Обсуждение результатов</w:t>
-      </w:r>
-    </w:p>
-    <w:p>
-      <w:pPr>
-        <w:pStyle w:val="FirstParagraph"/>
-      </w:pPr>
-      <w:r>
-        <w:t xml:space="preserve">Модели Ланчестера показывают, что:</w:t>
-      </w:r>
-    </w:p>
-    <w:p>
-      <w:pPr>
-        <w:pStyle w:val="Compact"/>
-        <w:numPr>
-          <w:ilvl w:val="0"/>
-          <w:numId w:val="1006"/>
-        </w:numPr>
-      </w:pPr>
-      <w:r>
-        <w:t xml:space="preserve">В бою между регулярными войсками преимущество определяется</w:t>
-      </w:r>
-      <w:r>
-        <w:t xml:space="preserve"> </w:t>
-      </w:r>
-      <w:r>
-        <w:t xml:space="preserve">квадратом численности:</w:t>
-      </w:r>
-      <w:r>
-        <w:t xml:space="preserve"> </w:t>
-      </w:r>
-      <m:oMath>
-        <m:r>
-          <m:t>c</m:t>
-        </m:r>
-        <m:sSup>
-          <m:e>
-            <m:r>
-              <m:t>x</m:t>
-            </m:r>
-          </m:e>
-          <m:sup>
-            <m:r>
-              <m:t>2</m:t>
-            </m:r>
-          </m:sup>
-        </m:sSup>
-        <m:r>
-          <m:rPr>
-            <m:sty m:val="p"/>
-          </m:rPr>
-          <m:t>−</m:t>
-        </m:r>
-        <m:r>
-          <m:t>b</m:t>
-        </m:r>
-        <m:sSup>
-          <m:e>
-            <m:r>
-              <m:t>y</m:t>
-            </m:r>
-          </m:e>
-          <m:sup>
-            <m:r>
-              <m:t>2</m:t>
-            </m:r>
-          </m:sup>
-        </m:sSup>
-      </m:oMath>
-      <w:r>
-        <w:t xml:space="preserve"> </w:t>
-      </w:r>
-      <w:r>
-        <w:t xml:space="preserve">— инвариант.</w:t>
-      </w:r>
-    </w:p>
-    <w:p>
-      <w:pPr>
-        <w:pStyle w:val="Compact"/>
-        <w:numPr>
-          <w:ilvl w:val="0"/>
-          <w:numId w:val="1006"/>
-        </w:numPr>
-      </w:pPr>
-      <w:r>
-        <w:t xml:space="preserve">Против партизан регулярным войскам нужно</w:t>
-      </w:r>
-      <w:r>
-        <w:t xml:space="preserve"> </w:t>
-      </w:r>
-      <w:r>
-        <w:rPr>
-          <w:b/>
-          <w:bCs/>
-        </w:rPr>
-        <w:t xml:space="preserve">квадратично</w:t>
-      </w:r>
-      <w:r>
-        <w:t xml:space="preserve"> </w:t>
-      </w:r>
-      <w:r>
-        <w:t xml:space="preserve">больше</w:t>
-      </w:r>
-      <w:r>
-        <w:t xml:space="preserve"> </w:t>
-      </w:r>
-      <w:r>
-        <w:t xml:space="preserve">начальной численности (вывод из</w:t>
-      </w:r>
-      <w:r>
-        <w:t xml:space="preserve"> </w:t>
-      </w:r>
-      <m:oMath>
-        <m:r>
-          <m:t>b</m:t>
-        </m:r>
-        <m:sSup>
-          <m:e>
-            <m:r>
-              <m:t>x</m:t>
-            </m:r>
-          </m:e>
-          <m:sup>
-            <m:r>
-              <m:t>2</m:t>
-            </m:r>
-          </m:sup>
-        </m:sSup>
-        <m:r>
-          <m:rPr>
-            <m:sty m:val="p"/>
-          </m:rPr>
-          <m:t>&gt;</m:t>
-        </m:r>
-        <m:r>
-          <m:t>c</m:t>
-        </m:r>
-        <m:r>
-          <m:t>y</m:t>
-        </m:r>
-      </m:oMath>
-      <w:r>
-        <w:t xml:space="preserve">).</w:t>
-      </w:r>
-    </w:p>
-    <w:p>
-      <w:pPr>
-        <w:pStyle w:val="Compact"/>
-        <w:numPr>
-          <w:ilvl w:val="0"/>
-          <w:numId w:val="1006"/>
-        </w:numPr>
-      </w:pPr>
-      <w:r>
-        <w:t xml:space="preserve">Между партизанами решающую роль играют коэффициенты эффективности.</w:t>
-      </w:r>
-    </w:p>
-    <w:bookmarkEnd w:id="53"/>
-    <w:bookmarkStart w:id="54" w:name="заключение"/>
-    <w:p>
-      <w:pPr>
-        <w:pStyle w:val="Heading1"/>
-      </w:pPr>
-      <w:r>
-        <w:t xml:space="preserve">7. Заключение</w:t>
-      </w:r>
-    </w:p>
-    <w:p>
-      <w:pPr>
-        <w:pStyle w:val="Compact"/>
-        <w:numPr>
-          <w:ilvl w:val="0"/>
-          <w:numId w:val="1007"/>
-        </w:numPr>
-      </w:pPr>
-      <w:r>
-        <w:t xml:space="preserve">Выведены три модели Ланчестера.</w:t>
-      </w:r>
-    </w:p>
-    <w:p>
-      <w:pPr>
-        <w:pStyle w:val="Compact"/>
-        <w:numPr>
-          <w:ilvl w:val="0"/>
-          <w:numId w:val="1007"/>
-        </w:numPr>
-      </w:pPr>
-      <w:r>
-        <w:t xml:space="preserve">Проведено численное решение в Julia для заданных параметров.</w:t>
-      </w:r>
-    </w:p>
-    <w:p>
-      <w:pPr>
-        <w:pStyle w:val="Compact"/>
-        <w:numPr>
-          <w:ilvl w:val="0"/>
-          <w:numId w:val="1007"/>
-        </w:numPr>
-      </w:pPr>
-      <w:r>
-        <w:t xml:space="preserve">Построены графики динамики численностей.</w:t>
-      </w:r>
-    </w:p>
-    <w:p>
-      <w:pPr>
-        <w:pStyle w:val="Compact"/>
-        <w:numPr>
-          <w:ilvl w:val="0"/>
-          <w:numId w:val="1007"/>
-        </w:numPr>
-      </w:pPr>
-      <w:r>
-        <w:t xml:space="preserve">Определены условия победы каждой стороны.</w:t>
-      </w:r>
-    </w:p>
-    <w:bookmarkEnd w:id="54"/>
-    <w:bookmarkStart w:id="56" w:name="список-литературы"/>
-    <w:p>
-      <w:pPr>
-        <w:pStyle w:val="Heading1"/>
-      </w:pPr>
-      <w:r>
         <w:t xml:space="preserve">Список литературы</w:t>
       </w:r>
     </w:p>
-    <w:bookmarkStart w:id="55" w:name="refs"/>
-    <w:bookmarkEnd w:id="55"/>
-    <w:bookmarkEnd w:id="56"/>
+    <w:bookmarkStart w:id="49" w:name="refs"/>
+    <w:bookmarkEnd w:id="49"/>
+    <w:bookmarkEnd w:id="50"/>
     <w:sectPr>
       <w:footnotePr>
         <w:numRestart w:val="eachSect"/>
@@ -2710,34 +1674,7 @@
     </w:lvlOverride>
   </w:num>
   <w:num w:numId="1002">
-    <w:abstractNumId w:val="99411"/>
-    <w:lvlOverride w:ilvl="0">
-      <w:startOverride w:val="1"/>
-    </w:lvlOverride>
-    <w:lvlOverride w:ilvl="1">
-      <w:startOverride w:val="1"/>
-    </w:lvlOverride>
-    <w:lvlOverride w:ilvl="2">
-      <w:startOverride w:val="1"/>
-    </w:lvlOverride>
-    <w:lvlOverride w:ilvl="3">
-      <w:startOverride w:val="1"/>
-    </w:lvlOverride>
-    <w:lvlOverride w:ilvl="4">
-      <w:startOverride w:val="1"/>
-    </w:lvlOverride>
-    <w:lvlOverride w:ilvl="5">
-      <w:startOverride w:val="1"/>
-    </w:lvlOverride>
-    <w:lvlOverride w:ilvl="6">
-      <w:startOverride w:val="1"/>
-    </w:lvlOverride>
-    <w:lvlOverride w:ilvl="7">
-      <w:startOverride w:val="1"/>
-    </w:lvlOverride>
-    <w:lvlOverride w:ilvl="8">
-      <w:startOverride w:val="1"/>
-    </w:lvlOverride>
+    <w:abstractNumId w:val="991"/>
   </w:num>
   <w:num w:numId="1003">
     <w:abstractNumId w:val="991"/>
@@ -2746,12 +1683,6 @@
     <w:abstractNumId w:val="991"/>
   </w:num>
   <w:num w:numId="1005">
-    <w:abstractNumId w:val="991"/>
-  </w:num>
-  <w:num w:numId="1006">
-    <w:abstractNumId w:val="991"/>
-  </w:num>
-  <w:num w:numId="1007">
     <w:abstractNumId w:val="991"/>
   </w:num>
 </w:numbering>

</xml_diff>